<commit_message>
Docs and printables for v0.31.0
User-facing documentation updated for audit mode and /sigil-audit command.

Changes:
- user-guide.md: new Audit Mode section under Configuration
- quick-start.md: /sigil-audit added to command cheat sheet
- troubleshooting.md: added audit mode Q&A entry; audit_mode in defaults
- glossary.md: added Audit Mode and Audit Log terms
- shared-context-setup.md: tip pointing to shared-standard-template.md
- releases/v0.31.0.md: release notes for non-technical users
- Sigil_OS_Quick_Reference.docx: version v0.31.0, /sigil-audit entry added
- Sigil_OS_Setup_Guide.docx: troubleshooting row for audit mode

Co-Authored-By: Claude Sonnet 4.6 <noreply@anthropic.com>
</commit_message>
<xml_diff>
--- a/docs/printables/Sigil_OS_Quick_Reference.docx
+++ b/docs/printables/Sigil_OS_Quick_Reference.docx
@@ -25,7 +25,7 @@
           <w:sz w:val="20"/>
           <w:szCs w:val="20"/>
         </w:rPr>
-        <w:t xml:space="preserve">  Quick Reference Card v0.27.0 | Inscribe it. Ship it.</w:t>
+        <w:t xml:space="preserve">  Quick Reference Card v0.31.0 | Inscribe it. Ship it.</w:t>
       </w:r>
     </w:p>
     <w:tbl>
@@ -401,6 +401,37 @@
                 <w:szCs w:val="16"/>
               </w:rPr>
               <w:t xml:space="preserve"> — Generate handoff package</w:t>
+            </w:r>
+          </w:p>
+          <w:p>
+            <w:pPr>
+              <w:spacing w:after="40"/>
+            </w:pPr>
+            <w:r>
+              <w:rPr>
+                <w:rFonts w:ascii="Arial" w:cs="Arial" w:eastAsia="Arial" w:hAnsi="Arial"/>
+                <w:sz w:val="16"/>
+                <w:szCs w:val="16"/>
+              </w:rPr>
+              <w:t xml:space="preserve"/>
+            </w:r>
+            <w:r>
+              <w:rPr>
+                <w:rFonts w:ascii="Arial" w:cs="Arial" w:eastAsia="Arial" w:hAnsi="Arial"/>
+                <w:b/>
+                <w:bCs/>
+                <w:sz w:val="16"/>
+                <w:szCs w:val="16"/>
+              </w:rPr>
+              <w:t xml:space="preserve">/sigil-audit</w:t>
+            </w:r>
+            <w:r>
+              <w:rPr>
+                <w:rFonts w:ascii="Arial" w:cs="Arial" w:eastAsia="Arial" w:hAnsi="Arial"/>
+                <w:sz w:val="16"/>
+                <w:szCs w:val="16"/>
+              </w:rPr>
+              <w:t xml:space="preserve"> — View workflow audit log</w:t>
             </w:r>
           </w:p>
           <w:p>

</xml_diff>